<commit_message>
lv6 RCA: unit 3 was power cycled on site at 20:42 on 9 Oct
Both failures needed a power cycle to recover; action 2 closed.

Co-Authored-By: Claude Opus 5.5 <noreply@anthropic.com>
Claude-Session: https://claude.ai/code/session_01BZ7jJsE6GWKm6ehHY39VNr
</commit_message>
<xml_diff>
--- a/Trinity 200V lv6 Stack Unit 3 RCA.docx
+++ b/Trinity 200V lv6 Stack Unit 3 RCA.docx
@@ -412,7 +412,7 @@
     </w:p>
     <w:p>
       <w:r>
-        <w:t xml:space="preserve">During the 200V VLAN cutover on Friday 9 October, unit 3 of the lv6 stack left the stack twice. Unit 4 is cabled only to unit 3, so it went out with it both times. The first time unit 3 restarted on its own and both units came back after 41 minutes. The second time unit 3 did not restart; it ran on its own (its console showed the standalone prompt) until it was power cycled on site at 13:35 the next day. No stack cable, power supply, fan or temperature message was logged before either failure, and the tech-support output taken on 16 October shows a clean stack cable, healthy power and normal temperatures. The one fault-specific record is a reload of unit 3 alone at 20:42:55 on 9 October with a software stack trace that does not match any normal reload. This points to unit 3 (hardware or firmware) rather than the cabling, and the trace needs Ruckus TAC to decode it.</w:t>
+        <w:t xml:space="preserve">During the 200V VLAN cutover on Friday 9 October, unit 3 of the lv6 stack left the stack twice. Unit 4 is cabled only to unit 3, so it went out with it both times. Both times unit 3 hung and did not recover by itself: the first time it was power cycled on site at about 20:42 and both units were back by 20:44; the second time it ran on its own (its console showed the standalone prompt) until it was power cycled on site at 13:35 the next day. No stack cable, power supply, fan or temperature message was logged before either failure, and the tech-support output taken on 16 October shows a clean stack cable, healthy power and normal temperatures. Unit 3 also has a reload-history entry of its own at 20:42:55 on 9 October, at the time of the first power cycle, with a stack trace that does not match any normal reload. A unit that hangs twice and recovers only on a power cycle points to unit 3 (hardware or firmware) rather than the cabling; Ruckus TAC needs to decode the trace.</w:t>
       </w:r>
     </w:p>
     <w:p>
@@ -1493,7 +1493,7 @@
                 <w:sz w:val="20"/>
                 <w:szCs w:val="20"/>
               </w:rPr>
-              <w:t xml:space="preserve">Unit 3 reloads by itself: an entry for unit 3 only, with a different software stack trace from every normal reload. Not a power cycle (a power cycle leaves no reload-history entry)</w:t>
+              <w:t xml:space="preserve">Unit 3 power cycled on site (confirmed by Dycom). The reload history has an entry for unit 3 only at this time, with a different stack trace from every normal reload</w:t>
             </w:r>
           </w:p>
         </w:tc>
@@ -2718,7 +2718,7 @@
                 <w:sz w:val="20"/>
                 <w:szCs w:val="20"/>
               </w:rPr>
-              <w:t xml:space="preserve">Unit 3 reset itself, or was reloaded from its own console</w:t>
+              <w:t xml:space="preserve">Matches the 9 October power cycle. The 10 October power cycle left no entry, so why this one did is a question for TAC</w:t>
             </w:r>
           </w:p>
         </w:tc>
@@ -2898,7 +2898,7 @@
                 <w:sz w:val="20"/>
                 <w:szCs w:val="20"/>
               </w:rPr>
-              <w:t xml:space="preserve">No record of who, if anyone, reloaded unit 3 at 20:42</w:t>
+              <w:t xml:space="preserve">No CLI reload of unit 3 recorded; both recoveries were power cycles on site</w:t>
             </w:r>
           </w:p>
         </w:tc>
@@ -3165,7 +3165,7 @@
                 <w:sz w:val="20"/>
                 <w:szCs w:val="20"/>
               </w:rPr>
-              <w:t xml:space="preserve">Fault in unit 3 (hardware or firmware). For: it dropped twice with no warning; it reset itself with an unusual stack trace; after the second drop it stayed hung as a standalone unit until power cycled; unit 4 never restarted. Against: it has run 6 days without a repeat</w:t>
+              <w:t xml:space="preserve">Fault in unit 3 (hardware or firmware). For: it dropped twice with no warning; both times it stayed hung and recovered only on a power cycle (after the second drop it ran standalone for 15 hours); unit 4 never restarted; the 9 October power cycle left an unusual stack trace on unit 3 only. Against: it has run 6 days without a repeat</w:t>
             </w:r>
           </w:p>
         </w:tc>
@@ -3221,7 +3221,7 @@
                 <w:sz w:val="20"/>
                 <w:szCs w:val="20"/>
               </w:rPr>
-              <w:t xml:space="preserve">Stack link 2/2/3 to 3/2/1 (DAC or port). For: losing that one link gives the same symptom (units 3 and 4 drop together). Against: zero errors on both ends over 6 days, genuine RUCKUS part, and it would not explain unit 3 restarting itself or hanging</w:t>
+              <w:t xml:space="preserve">Stack link 2/2/3 to 3/2/1 (DAC or port). For: losing that one link gives the same symptom (units 3 and 4 drop together). Against: zero errors on both ends over 6 days, genuine RUCKUS part, and it would not explain unit 3 hanging until power cycled</w:t>
             </w:r>
           </w:p>
         </w:tc>
@@ -3483,7 +3483,7 @@
     </w:p>
     <w:p>
       <w:r>
-        <w:t xml:space="preserve">The most likely root cause is a fault in unit 3 (FNM4319U09A), either in the hardware or in FastIron 10.0.10g_cd3 on that unit. This is not yet confirmed: the 20:42:55 stack trace needs decoding by Ruckus TAC, and the 9 October logs are no longer on the switch.</w:t>
+        <w:t xml:space="preserve">The most likely root cause is a fault in unit 3 (FNM4319U09A), either in the hardware or in FastIron 10.0.10g_cd3 on that unit. Both failures needed a power cycle to recover, which a cable fault would not. This is not yet confirmed: the 20:42:55 stack trace needs decoding by Ruckus TAC, and the 9 October logs are no longer on the switch.</w:t>
       </w:r>
     </w:p>
     <w:p>
@@ -3722,7 +3722,7 @@
                 <w:sz w:val="20"/>
                 <w:szCs w:val="20"/>
               </w:rPr>
-              <w:t xml:space="preserve">Open a Ruckus TAC case for unit 3 (FNM4319U09A, 10.0.10g_cd3). Send the 16 October tech-support and the 9 and 10 October log captures. Ask TAC to decode the unit 3 reload trace (9 Oct 21:42:55 local), say whether it is a known defect, and name the fixed release</w:t>
+              <w:t xml:space="preserve">Open a Ruckus TAC case for unit 3 (FNM4319U09A, 10.0.10g_cd3). Send the 16 October tech-support and the 9 and 10 October log captures. Ask TAC to decode the unit 3 reload trace (9 Oct 21:42:55 local, at the power cycle), explain why the 10 October power cycle left no entry, say whether it is a known defect, and name the fixed release</w:t>
             </w:r>
           </w:p>
         </w:tc>
@@ -3812,7 +3812,7 @@
                 <w:sz w:val="20"/>
                 <w:szCs w:val="20"/>
               </w:rPr>
-              <w:t xml:space="preserve">Confirm whether anyone reloaded unit 3 from its console at about 20:42 on 9 October</w:t>
+              <w:t xml:space="preserve">Confirm whether anyone reloaded unit 3 from its console at about 20:42 on 9 October. Answer: no, it was power cycled on site</w:t>
             </w:r>
           </w:p>
         </w:tc>
@@ -3829,7 +3829,7 @@
                 <w:sz w:val="20"/>
                 <w:szCs w:val="20"/>
               </w:rPr>
-              <w:t xml:space="preserve">Dycom / Trinity</w:t>
+              <w:t xml:space="preserve">Dycom</w:t>
             </w:r>
           </w:p>
         </w:tc>
@@ -3863,7 +3863,7 @@
                 <w:sz w:val="20"/>
                 <w:szCs w:val="20"/>
               </w:rPr>
-              <w:t xml:space="preserve">Open</w:t>
+              <w:t xml:space="preserve">Closed</w:t>
             </w:r>
           </w:p>
         </w:tc>
@@ -4687,7 +4687,7 @@
     </w:p>
     <w:p>
       <w:r>
-        <w:t xml:space="preserve">From show stack failover on 16 October. Times are local (AEDT). The 9 Oct 18:19:50 and 10 Oct 16:34:35 entries appear on all 7 units (the two whole-stack reloads). The 9 Oct 21:42:55 entry is on unit 3 only.</w:t>
+        <w:t xml:space="preserve">From show stack failover on 16 October. Times are local (AEDT). The 9 Oct 18:19:50 and 10 Oct 16:34:35 entries appear on all 7 units (the two whole-stack reloads). The 9 Oct 21:42:55 entry is on unit 3 only and matches its power cycle on site; the 10 October power cycle (about 14:35 local) left no entry.</w:t>
       </w:r>
     </w:p>
     <w:p>

</xml_diff>

<commit_message>
lv6 RCA: add FastIron 10.0.10g release notes review
Relevant fixes after cd3 (FI-318592 ring LLDP loop, FI-307270,
FI-312886, FI-312861), open issues in cd10, upgrade to cd10 before
closing the ring.

Co-Authored-By: Claude Opus 5.5 <noreply@anthropic.com>
Claude-Session: https://claude.ai/code/session_01BZ7jJsE6GWKm6ehHY39VNr
</commit_message>
<xml_diff>
--- a/Trinity 200V lv6 Stack Unit 3 RCA.docx
+++ b/Trinity 200V lv6 Stack Unit 3 RCA.docx
@@ -1844,7 +1844,7 @@
                 <w:sz w:val="20"/>
                 <w:szCs w:val="20"/>
               </w:rPr>
-              <w:t xml:space="preserve">Devices losing pings; the DAC is removed</w:t>
+              <w:t xml:space="preserve">Devices losing pings; the DAC is removed. Matches known defect FI-318592 (LLDP loop inside a ring-cabled stack, fixed in 10.0.10g_cd7; see Firmware release notes)</w:t>
             </w:r>
           </w:p>
         </w:tc>
@@ -3165,7 +3165,7 @@
                 <w:sz w:val="20"/>
                 <w:szCs w:val="20"/>
               </w:rPr>
-              <w:t xml:space="preserve">Fault in unit 3 (hardware or firmware). For: it dropped twice with no warning; both times it stayed hung and recovered only on a power cycle (after the second drop it ran standalone for 15 hours); unit 4 never restarted; the 9 October power cycle left an unusual stack trace on unit 3 only. Against: it has run 6 days without a repeat</w:t>
+              <w:t xml:space="preserve">Fault in unit 3 (hardware or firmware). For: it dropped twice with no warning; both times it stayed hung and recovered only on a power cycle (after the second drop it ran standalone for 15 hours); unit 4 never restarted; the 9 October power cycle left an unusual stack trace on unit 3 only; the release notes list FI-307270 (a stack unit stopped forwarding on all ports, no trigger), fixed after our build. Against: it has run 6 days without a repeat</w:t>
             </w:r>
           </w:p>
         </w:tc>
@@ -3277,7 +3277,7 @@
                 <w:sz w:val="20"/>
                 <w:szCs w:val="20"/>
               </w:rPr>
-              <w:t xml:space="preserve">Change activity on 9 October (system-max spanning-tree raised to 40, new VLANs with spanning tree, many port moves). For: both failures came within 5 hours of the reload and during the cutover; a spanning-tree root change came 3 minutes before the second drop. Against: the same configuration has run 6 days without fault, and lv3 and lv4 had the same change without failures</w:t>
+              <w:t xml:space="preserve">Change activity on 9 October (system-max spanning-tree raised to 40, new VLANs with spanning tree, many port moves). For: both failures came within 5 hours of the reload and during the cutover; a spanning-tree root change came 3 minutes before the second drop, and FI-312886 (fixed in cd5) says a loop on the data ports can starve stack traffic and break the stack. Against: the same configuration has run 6 days without fault, and lv3 and lv4 had the same change without failures</w:t>
             </w:r>
           </w:p>
         </w:tc>
@@ -3468,6 +3468,727 @@
         </w:tc>
       </w:tr>
     </w:tbl>
+    <w:p>
+      <w:pPr>
+        <w:keepNext/>
+        <w:spacing w:before="240" w:after="120"/>
+      </w:pPr>
+      <w:r>
+        <w:rPr>
+          <w:b/>
+          <w:bCs/>
+        </w:rPr>
+        <w:t xml:space="preserve">Firmware release notes</w:t>
+      </w:r>
+    </w:p>
+    <w:p>
+      <w:r>
+        <w:t xml:space="preserve">lv6 runs FastIron 10.0.10g_cd3. The release notes for 10.0.10g_cd3, cd5, cd8 and cd10 (cd10 published 12 August 2026) were checked on 16 October. 93 issues were fixed between cd3 and cd10. None matches unit 3 exactly (a member unit that leaves the stack without warning and stays hung until power cycled), but the issues below are relevant to lv6.</w:t>
+      </w:r>
+    </w:p>
+    <w:p>
+      <w:pPr>
+        <w:spacing w:after="80"/>
+      </w:pPr>
+    </w:p>
+    <w:tbl>
+      <w:tblPr>
+        <w:tblW w:w="9026" w:type="dxa"/>
+        <w:tblBorders>
+          <w:top w:val="single" w:sz="4" w:space="0" w:color="A6A6A6"/>
+          <w:left w:val="single" w:sz="4" w:space="0" w:color="A6A6A6"/>
+          <w:bottom w:val="single" w:sz="4" w:space="0" w:color="A6A6A6"/>
+          <w:right w:val="single" w:sz="4" w:space="0" w:color="A6A6A6"/>
+          <w:insideH w:val="single" w:sz="4" w:space="0" w:color="A6A6A6"/>
+          <w:insideV w:val="single" w:sz="4" w:space="0" w:color="A6A6A6"/>
+        </w:tblBorders>
+        <w:tblLayout w:type="fixed"/>
+        <w:tblCellMar>
+          <w:top w:w="40" w:type="dxa"/>
+          <w:left w:w="80" w:type="dxa"/>
+          <w:bottom w:w="40" w:type="dxa"/>
+          <w:right w:w="80" w:type="dxa"/>
+        </w:tblCellMar>
+      </w:tblPr>
+      <w:tblGrid>
+        <w:gridCol w:w="1173"/>
+        <w:gridCol w:w="1173"/>
+        <w:gridCol w:w="3610"/>
+        <w:gridCol w:w="3070"/>
+      </w:tblGrid>
+      <w:tr>
+        <w:trPr>
+          <w:cantSplit/>
+          <w:tblHeader/>
+        </w:trPr>
+        <w:tc>
+          <w:tcPr>
+            <w:tcW w:w="1173" w:type="dxa"/>
+            <w:shd w:val="clear" w:color="auto" w:fill="D9D9D9"/>
+          </w:tcPr>
+          <w:p>
+            <w:pPr>
+              <w:spacing w:after="0" w:line="240" w:lineRule="auto"/>
+            </w:pPr>
+            <w:r>
+              <w:rPr>
+                <w:b/>
+                <w:bCs/>
+                <w:sz w:val="20"/>
+                <w:szCs w:val="20"/>
+              </w:rPr>
+              <w:t xml:space="preserve">Issue</w:t>
+            </w:r>
+          </w:p>
+        </w:tc>
+        <w:tc>
+          <w:tcPr>
+            <w:tcW w:w="1173" w:type="dxa"/>
+            <w:shd w:val="clear" w:color="auto" w:fill="D9D9D9"/>
+          </w:tcPr>
+          <w:p>
+            <w:pPr>
+              <w:spacing w:after="0" w:line="240" w:lineRule="auto"/>
+            </w:pPr>
+            <w:r>
+              <w:rPr>
+                <w:b/>
+                <w:bCs/>
+                <w:sz w:val="20"/>
+                <w:szCs w:val="20"/>
+              </w:rPr>
+              <w:t xml:space="preserve">Status</w:t>
+            </w:r>
+          </w:p>
+        </w:tc>
+        <w:tc>
+          <w:tcPr>
+            <w:tcW w:w="3610" w:type="dxa"/>
+            <w:shd w:val="clear" w:color="auto" w:fill="D9D9D9"/>
+          </w:tcPr>
+          <w:p>
+            <w:pPr>
+              <w:spacing w:after="0" w:line="240" w:lineRule="auto"/>
+            </w:pPr>
+            <w:r>
+              <w:rPr>
+                <w:b/>
+                <w:bCs/>
+                <w:sz w:val="20"/>
+                <w:szCs w:val="20"/>
+              </w:rPr>
+              <w:t xml:space="preserve">Symptom (from the release notes)</w:t>
+            </w:r>
+          </w:p>
+        </w:tc>
+        <w:tc>
+          <w:tcPr>
+            <w:tcW w:w="3070" w:type="dxa"/>
+            <w:shd w:val="clear" w:color="auto" w:fill="D9D9D9"/>
+          </w:tcPr>
+          <w:p>
+            <w:pPr>
+              <w:spacing w:after="0" w:line="240" w:lineRule="auto"/>
+            </w:pPr>
+            <w:r>
+              <w:rPr>
+                <w:b/>
+                <w:bCs/>
+                <w:sz w:val="20"/>
+                <w:szCs w:val="20"/>
+              </w:rPr>
+              <w:t xml:space="preserve">Relevance to lv6</w:t>
+            </w:r>
+          </w:p>
+        </w:tc>
+      </w:tr>
+      <w:tr>
+        <w:trPr>
+          <w:cantSplit/>
+        </w:trPr>
+        <w:tc>
+          <w:tcPr>
+            <w:tcW w:w="1173" w:type="dxa"/>
+          </w:tcPr>
+          <w:p>
+            <w:pPr>
+              <w:spacing w:after="0" w:line="240" w:lineRule="auto"/>
+            </w:pPr>
+            <w:r>
+              <w:rPr>
+                <w:sz w:val="20"/>
+                <w:szCs w:val="20"/>
+              </w:rPr>
+              <w:t xml:space="preserve">FI-318592</w:t>
+            </w:r>
+          </w:p>
+        </w:tc>
+        <w:tc>
+          <w:tcPr>
+            <w:tcW w:w="1173" w:type="dxa"/>
+          </w:tcPr>
+          <w:p>
+            <w:pPr>
+              <w:spacing w:after="0" w:line="240" w:lineRule="auto"/>
+            </w:pPr>
+            <w:r>
+              <w:rPr>
+                <w:sz w:val="20"/>
+                <w:szCs w:val="20"/>
+              </w:rPr>
+              <w:t xml:space="preserve">Fixed in cd7</w:t>
+            </w:r>
+          </w:p>
+        </w:tc>
+        <w:tc>
+          <w:tcPr>
+            <w:tcW w:w="3610" w:type="dxa"/>
+          </w:tcPr>
+          <w:p>
+            <w:pPr>
+              <w:spacing w:after="0" w:line="240" w:lineRule="auto"/>
+            </w:pPr>
+            <w:r>
+              <w:rPr>
+                <w:sz w:val="20"/>
+                <w:szCs w:val="20"/>
+              </w:rPr>
+              <w:t xml:space="preserve">In a stack cabled as a ring, LLDP packets are sent over the stack ports and cause a loop inside the stack. Workaround: cable the stack as a chain</w:t>
+            </w:r>
+          </w:p>
+        </w:tc>
+        <w:tc>
+          <w:tcPr>
+            <w:tcW w:w="3070" w:type="dxa"/>
+          </w:tcPr>
+          <w:p>
+            <w:pPr>
+              <w:spacing w:after="0" w:line="240" w:lineRule="auto"/>
+            </w:pPr>
+            <w:r>
+              <w:rPr>
+                <w:sz w:val="20"/>
+                <w:szCs w:val="20"/>
+              </w:rPr>
+              <w:t xml:space="preserve">High. Matches the packet loss when the ring was closed on 10 October. Do not close the ring until lv6 runs cd7 or later</w:t>
+            </w:r>
+          </w:p>
+        </w:tc>
+      </w:tr>
+      <w:tr>
+        <w:trPr>
+          <w:cantSplit/>
+        </w:trPr>
+        <w:tc>
+          <w:tcPr>
+            <w:tcW w:w="1173" w:type="dxa"/>
+          </w:tcPr>
+          <w:p>
+            <w:pPr>
+              <w:spacing w:after="0" w:line="240" w:lineRule="auto"/>
+            </w:pPr>
+            <w:r>
+              <w:rPr>
+                <w:sz w:val="20"/>
+                <w:szCs w:val="20"/>
+              </w:rPr>
+              <w:t xml:space="preserve">FI-307270</w:t>
+            </w:r>
+          </w:p>
+        </w:tc>
+        <w:tc>
+          <w:tcPr>
+            <w:tcW w:w="1173" w:type="dxa"/>
+          </w:tcPr>
+          <w:p>
+            <w:pPr>
+              <w:spacing w:after="0" w:line="240" w:lineRule="auto"/>
+            </w:pPr>
+            <w:r>
+              <w:rPr>
+                <w:sz w:val="20"/>
+                <w:szCs w:val="20"/>
+              </w:rPr>
+              <w:t xml:space="preserve">Fixed in cd7</w:t>
+            </w:r>
+          </w:p>
+        </w:tc>
+        <w:tc>
+          <w:tcPr>
+            <w:tcW w:w="3610" w:type="dxa"/>
+          </w:tcPr>
+          <w:p>
+            <w:pPr>
+              <w:spacing w:after="0" w:line="240" w:lineRule="auto"/>
+            </w:pPr>
+            <w:r>
+              <w:rPr>
+                <w:sz w:val="20"/>
+                <w:szCs w:val="20"/>
+              </w:rPr>
+              <w:t xml:space="preserve">The second unit in the stack stopped forwarding traffic from all ports. No trigger</w:t>
+            </w:r>
+          </w:p>
+        </w:tc>
+        <w:tc>
+          <w:tcPr>
+            <w:tcW w:w="3070" w:type="dxa"/>
+          </w:tcPr>
+          <w:p>
+            <w:pPr>
+              <w:spacing w:after="0" w:line="240" w:lineRule="auto"/>
+            </w:pPr>
+            <w:r>
+              <w:rPr>
+                <w:sz w:val="20"/>
+                <w:szCs w:val="20"/>
+              </w:rPr>
+              <w:t xml:space="preserve">Medium. Closest symptom to unit 3. Ask TAC whether it matches</w:t>
+            </w:r>
+          </w:p>
+        </w:tc>
+      </w:tr>
+      <w:tr>
+        <w:trPr>
+          <w:cantSplit/>
+        </w:trPr>
+        <w:tc>
+          <w:tcPr>
+            <w:tcW w:w="1173" w:type="dxa"/>
+          </w:tcPr>
+          <w:p>
+            <w:pPr>
+              <w:spacing w:after="0" w:line="240" w:lineRule="auto"/>
+            </w:pPr>
+            <w:r>
+              <w:rPr>
+                <w:sz w:val="20"/>
+                <w:szCs w:val="20"/>
+              </w:rPr>
+              <w:t xml:space="preserve">FI-312886</w:t>
+            </w:r>
+          </w:p>
+        </w:tc>
+        <w:tc>
+          <w:tcPr>
+            <w:tcW w:w="1173" w:type="dxa"/>
+          </w:tcPr>
+          <w:p>
+            <w:pPr>
+              <w:spacing w:after="0" w:line="240" w:lineRule="auto"/>
+            </w:pPr>
+            <w:r>
+              <w:rPr>
+                <w:sz w:val="20"/>
+                <w:szCs w:val="20"/>
+              </w:rPr>
+              <w:t xml:space="preserve">Fixed in cd5</w:t>
+            </w:r>
+          </w:p>
+        </w:tc>
+        <w:tc>
+          <w:tcPr>
+            <w:tcW w:w="3610" w:type="dxa"/>
+          </w:tcPr>
+          <w:p>
+            <w:pPr>
+              <w:spacing w:after="0" w:line="240" w:lineRule="auto"/>
+            </w:pPr>
+            <w:r>
+              <w:rPr>
+                <w:sz w:val="20"/>
+                <w:szCs w:val="20"/>
+              </w:rPr>
+              <w:t xml:space="preserve">A high rate of control packets on data ports (from an L2 loop) starves the stack ports; the stack may break</w:t>
+            </w:r>
+          </w:p>
+        </w:tc>
+        <w:tc>
+          <w:tcPr>
+            <w:tcW w:w="3070" w:type="dxa"/>
+          </w:tcPr>
+          <w:p>
+            <w:pPr>
+              <w:spacing w:after="0" w:line="240" w:lineRule="auto"/>
+            </w:pPr>
+            <w:r>
+              <w:rPr>
+                <w:sz w:val="20"/>
+                <w:szCs w:val="20"/>
+              </w:rPr>
+              <w:t xml:space="preserve">Medium. Possible on 9 October; does not explain unit 3 staying hung</w:t>
+            </w:r>
+          </w:p>
+        </w:tc>
+      </w:tr>
+      <w:tr>
+        <w:trPr>
+          <w:cantSplit/>
+        </w:trPr>
+        <w:tc>
+          <w:tcPr>
+            <w:tcW w:w="1173" w:type="dxa"/>
+          </w:tcPr>
+          <w:p>
+            <w:pPr>
+              <w:spacing w:after="0" w:line="240" w:lineRule="auto"/>
+            </w:pPr>
+            <w:r>
+              <w:rPr>
+                <w:sz w:val="20"/>
+                <w:szCs w:val="20"/>
+              </w:rPr>
+              <w:t xml:space="preserve">FI-312861</w:t>
+            </w:r>
+          </w:p>
+        </w:tc>
+        <w:tc>
+          <w:tcPr>
+            <w:tcW w:w="1173" w:type="dxa"/>
+          </w:tcPr>
+          <w:p>
+            <w:pPr>
+              <w:spacing w:after="0" w:line="240" w:lineRule="auto"/>
+            </w:pPr>
+            <w:r>
+              <w:rPr>
+                <w:sz w:val="20"/>
+                <w:szCs w:val="20"/>
+              </w:rPr>
+              <w:t xml:space="preserve">Fixed in cd6</w:t>
+            </w:r>
+          </w:p>
+        </w:tc>
+        <w:tc>
+          <w:tcPr>
+            <w:tcW w:w="3610" w:type="dxa"/>
+          </w:tcPr>
+          <w:p>
+            <w:pPr>
+              <w:spacing w:after="0" w:line="240" w:lineRule="auto"/>
+            </w:pPr>
+            <w:r>
+              <w:rPr>
+                <w:sz w:val="20"/>
+                <w:szCs w:val="20"/>
+              </w:rPr>
+              <w:t xml:space="preserve">Critical, Alert and Warning events are not shown in SmartZone for a switch</w:t>
+            </w:r>
+          </w:p>
+        </w:tc>
+        <w:tc>
+          <w:tcPr>
+            <w:tcW w:w="3070" w:type="dxa"/>
+          </w:tcPr>
+          <w:p>
+            <w:pPr>
+              <w:spacing w:after="0" w:line="240" w:lineRule="auto"/>
+            </w:pPr>
+            <w:r>
+              <w:rPr>
+                <w:sz w:val="20"/>
+                <w:szCs w:val="20"/>
+              </w:rPr>
+              <w:t xml:space="preserve">Explains why SmartZone gave no alarm for the overnight outage</w:t>
+            </w:r>
+          </w:p>
+        </w:tc>
+      </w:tr>
+      <w:tr>
+        <w:trPr>
+          <w:cantSplit/>
+        </w:trPr>
+        <w:tc>
+          <w:tcPr>
+            <w:tcW w:w="1173" w:type="dxa"/>
+          </w:tcPr>
+          <w:p>
+            <w:pPr>
+              <w:spacing w:after="0" w:line="240" w:lineRule="auto"/>
+            </w:pPr>
+            <w:r>
+              <w:rPr>
+                <w:sz w:val="20"/>
+                <w:szCs w:val="20"/>
+              </w:rPr>
+              <w:t xml:space="preserve">FI-319392</w:t>
+            </w:r>
+          </w:p>
+        </w:tc>
+        <w:tc>
+          <w:tcPr>
+            <w:tcW w:w="1173" w:type="dxa"/>
+          </w:tcPr>
+          <w:p>
+            <w:pPr>
+              <w:spacing w:after="0" w:line="240" w:lineRule="auto"/>
+            </w:pPr>
+            <w:r>
+              <w:rPr>
+                <w:sz w:val="20"/>
+                <w:szCs w:val="20"/>
+              </w:rPr>
+              <w:t xml:space="preserve">Fixed in cd5</w:t>
+            </w:r>
+          </w:p>
+        </w:tc>
+        <w:tc>
+          <w:tcPr>
+            <w:tcW w:w="3610" w:type="dxa"/>
+          </w:tcPr>
+          <w:p>
+            <w:pPr>
+              <w:spacing w:after="0" w:line="240" w:lineRule="auto"/>
+            </w:pPr>
+            <w:r>
+              <w:rPr>
+                <w:sz w:val="20"/>
+                <w:szCs w:val="20"/>
+              </w:rPr>
+              <w:t xml:space="preserve">show logging shows no output after a burst of log messages</w:t>
+            </w:r>
+          </w:p>
+        </w:tc>
+        <w:tc>
+          <w:tcPr>
+            <w:tcW w:w="3070" w:type="dxa"/>
+          </w:tcPr>
+          <w:p>
+            <w:pPr>
+              <w:spacing w:after="0" w:line="240" w:lineRule="auto"/>
+            </w:pPr>
+            <w:r>
+              <w:rPr>
+                <w:sz w:val="20"/>
+                <w:szCs w:val="20"/>
+              </w:rPr>
+              <w:t xml:space="preserve">Affects evidence collection</w:t>
+            </w:r>
+          </w:p>
+        </w:tc>
+      </w:tr>
+      <w:tr>
+        <w:trPr>
+          <w:cantSplit/>
+        </w:trPr>
+        <w:tc>
+          <w:tcPr>
+            <w:tcW w:w="1173" w:type="dxa"/>
+          </w:tcPr>
+          <w:p>
+            <w:pPr>
+              <w:spacing w:after="0" w:line="240" w:lineRule="auto"/>
+            </w:pPr>
+            <w:r>
+              <w:rPr>
+                <w:sz w:val="20"/>
+                <w:szCs w:val="20"/>
+              </w:rPr>
+              <w:t xml:space="preserve">FI-311871</w:t>
+            </w:r>
+          </w:p>
+        </w:tc>
+        <w:tc>
+          <w:tcPr>
+            <w:tcW w:w="1173" w:type="dxa"/>
+          </w:tcPr>
+          <w:p>
+            <w:pPr>
+              <w:spacing w:after="0" w:line="240" w:lineRule="auto"/>
+            </w:pPr>
+            <w:r>
+              <w:rPr>
+                <w:sz w:val="20"/>
+                <w:szCs w:val="20"/>
+              </w:rPr>
+              <w:t xml:space="preserve">Open in cd10</w:t>
+            </w:r>
+          </w:p>
+        </w:tc>
+        <w:tc>
+          <w:tcPr>
+            <w:tcW w:w="3610" w:type="dxa"/>
+          </w:tcPr>
+          <w:p>
+            <w:pPr>
+              <w:spacing w:after="0" w:line="240" w:lineRule="auto"/>
+            </w:pPr>
+            <w:r>
+              <w:rPr>
+                <w:sz w:val="20"/>
+                <w:szCs w:val="20"/>
+              </w:rPr>
+              <w:t xml:space="preserve">Unexpected reload sometimes after supportsave or show media ethernet all (part of show tech-support)</w:t>
+            </w:r>
+          </w:p>
+        </w:tc>
+        <w:tc>
+          <w:tcPr>
+            <w:tcW w:w="3070" w:type="dxa"/>
+          </w:tcPr>
+          <w:p>
+            <w:pPr>
+              <w:spacing w:after="0" w:line="240" w:lineRule="auto"/>
+            </w:pPr>
+            <w:r>
+              <w:rPr>
+                <w:sz w:val="20"/>
+                <w:szCs w:val="20"/>
+              </w:rPr>
+              <w:t xml:space="preserve">Run tech-support captures at a quiet time</w:t>
+            </w:r>
+          </w:p>
+        </w:tc>
+      </w:tr>
+      <w:tr>
+        <w:trPr>
+          <w:cantSplit/>
+        </w:trPr>
+        <w:tc>
+          <w:tcPr>
+            <w:tcW w:w="1173" w:type="dxa"/>
+          </w:tcPr>
+          <w:p>
+            <w:pPr>
+              <w:spacing w:after="0" w:line="240" w:lineRule="auto"/>
+            </w:pPr>
+            <w:r>
+              <w:rPr>
+                <w:sz w:val="20"/>
+                <w:szCs w:val="20"/>
+              </w:rPr>
+              <w:t xml:space="preserve">FI-290918</w:t>
+            </w:r>
+          </w:p>
+        </w:tc>
+        <w:tc>
+          <w:tcPr>
+            <w:tcW w:w="1173" w:type="dxa"/>
+          </w:tcPr>
+          <w:p>
+            <w:pPr>
+              <w:spacing w:after="0" w:line="240" w:lineRule="auto"/>
+            </w:pPr>
+            <w:r>
+              <w:rPr>
+                <w:sz w:val="20"/>
+                <w:szCs w:val="20"/>
+              </w:rPr>
+              <w:t xml:space="preserve">Open in cd10</w:t>
+            </w:r>
+          </w:p>
+        </w:tc>
+        <w:tc>
+          <w:tcPr>
+            <w:tcW w:w="3610" w:type="dxa"/>
+          </w:tcPr>
+          <w:p>
+            <w:pPr>
+              <w:spacing w:after="0" w:line="240" w:lineRule="auto"/>
+            </w:pPr>
+            <w:r>
+              <w:rPr>
+                <w:sz w:val="20"/>
+                <w:szCs w:val="20"/>
+              </w:rPr>
+              <w:t xml:space="preserve">A few CRC or input errors on stack and uplink ports with 25G passive 5 m DACs on ICX8200</w:t>
+            </w:r>
+          </w:p>
+        </w:tc>
+        <w:tc>
+          <w:tcPr>
+            <w:tcW w:w="3070" w:type="dxa"/>
+          </w:tcPr>
+          <w:p>
+            <w:pPr>
+              <w:spacing w:after="0" w:line="240" w:lineRule="auto"/>
+            </w:pPr>
+            <w:r>
+              <w:rPr>
+                <w:sz w:val="20"/>
+                <w:szCs w:val="20"/>
+              </w:rPr>
+              <w:t xml:space="preserve">Use 3 m or shorter (as now) for the ring cable</w:t>
+            </w:r>
+          </w:p>
+        </w:tc>
+      </w:tr>
+    </w:tbl>
+    <w:p>
+      <w:pPr>
+        <w:spacing w:after="80"/>
+      </w:pPr>
+    </w:p>
+    <w:p>
+      <w:r>
+        <w:t xml:space="preserve">Checked and not applicable to lv6:</w:t>
+      </w:r>
+    </w:p>
+    <w:p>
+      <w:pPr>
+        <w:pStyle w:val="ListParagraph"/>
+        <w:numPr>
+          <w:ilvl w:val="0"/>
+          <w:numId w:val="1"/>
+        </w:numPr>
+        <w:spacing w:after="60"/>
+      </w:pPr>
+      <w:r>
+        <w:t xml:space="preserve">FI-322504 (fixed in cd8): crash when an RSTP port is disabled. lv6 runs 802.1D spanning tree, not RSTP</w:t>
+      </w:r>
+    </w:p>
+    <w:p>
+      <w:pPr>
+        <w:pStyle w:val="ListParagraph"/>
+        <w:numPr>
+          <w:ilvl w:val="0"/>
+          <w:numId w:val="1"/>
+        </w:numPr>
+        <w:spacing w:after="60"/>
+      </w:pPr>
+      <w:r>
+        <w:t xml:space="preserve">FI-307360 (cd7): stack unit reloads with sFlow enabled. sFlow is not configured</w:t>
+      </w:r>
+    </w:p>
+    <w:p>
+      <w:pPr>
+        <w:pStyle w:val="ListParagraph"/>
+        <w:numPr>
+          <w:ilvl w:val="0"/>
+          <w:numId w:val="1"/>
+        </w:numPr>
+        <w:spacing w:after="60"/>
+      </w:pPr>
+      <w:r>
+        <w:t xml:space="preserve">FI-325415 (cd10): DHCP snooping database race. DHCP snooping and ARP inspection are not configured</w:t>
+      </w:r>
+    </w:p>
+    <w:p>
+      <w:pPr>
+        <w:pStyle w:val="ListParagraph"/>
+        <w:numPr>
+          <w:ilvl w:val="0"/>
+          <w:numId w:val="1"/>
+        </w:numPr>
+        <w:spacing w:after="60"/>
+      </w:pPr>
+      <w:r>
+        <w:t xml:space="preserve">FI-319187 (cd7): stack member reboot from malformed web requests. No web sessions; and unit 3 hung rather than rebooting</w:t>
+      </w:r>
+    </w:p>
+    <w:p>
+      <w:pPr>
+        <w:pStyle w:val="ListParagraph"/>
+        <w:numPr>
+          <w:ilvl w:val="0"/>
+          <w:numId w:val="1"/>
+        </w:numPr>
+        <w:spacing w:after="60"/>
+      </w:pPr>
+      <w:r>
+        <w:t xml:space="preserve">FI-319366 (cd8): reboot when temperature sensor 3 reads 0 deg C. Unit 3 temperatures are normal and it did not reboot</w:t>
+      </w:r>
+    </w:p>
     <w:p>
       <w:pPr>
         <w:keepNext/>
@@ -3540,7 +4261,20 @@
         <w:spacing w:after="60"/>
       </w:pPr>
       <w:r>
-        <w:t xml:space="preserve">SmartZone still shows 5 stack members instead of 7, so it cannot be relied on to show the stack's state</w:t>
+        <w:t xml:space="preserve">SmartZone still shows 5 stack members instead of 7, and on cd3 it does not show the switch's Critical, Alert or Warning events (FI-312861), so it cannot be relied on to show the stack's state</w:t>
+      </w:r>
+    </w:p>
+    <w:p>
+      <w:pPr>
+        <w:pStyle w:val="ListParagraph"/>
+        <w:numPr>
+          <w:ilvl w:val="0"/>
+          <w:numId w:val="1"/>
+        </w:numPr>
+        <w:spacing w:after="60"/>
+      </w:pPr>
+      <w:r>
+        <w:t xml:space="preserve">lv6 runs 10.0.10g_cd3; later builds on the same release fix several stack-related defects</w:t>
       </w:r>
     </w:p>
     <w:p>
@@ -3722,7 +4456,7 @@
                 <w:sz w:val="20"/>
                 <w:szCs w:val="20"/>
               </w:rPr>
-              <w:t xml:space="preserve">Open a Ruckus TAC case for unit 3 (FNM4319U09A, 10.0.10g_cd3). Send the 16 October tech-support and the 9 and 10 October log captures. Ask TAC to decode the unit 3 reload trace (9 Oct 21:42:55 local, at the power cycle), explain why the 10 October power cycle left no entry, say whether it is a known defect, and name the fixed release</w:t>
+              <w:t xml:space="preserve">Open a Ruckus TAC case for unit 3 (FNM4319U09A, 10.0.10g_cd3). Send the 16 October tech-support and the 9 and 10 October log captures. Ask TAC to decode the unit 3 reload trace (9 Oct 21:42:55 local, at the power cycle), explain why the 10 October power cycle left no entry, say whether it matches FI-307270 or FI-312886 or another known defect, and confirm 10.0.10g_cd10 as the target release</w:t>
             </w:r>
           </w:p>
         </w:tc>
@@ -4082,7 +4816,7 @@
                 <w:sz w:val="20"/>
                 <w:szCs w:val="20"/>
               </w:rPr>
-              <w:t xml:space="preserve">Close the ring 4/2/3 to 7/2/3 with a cable on the Ruckus supported list for the ICX8200 and of the right length (the stack-port configuration is already in place). The DAC tried on 10 October caused packet loss and was removed. Do it in a change window</w:t>
+              <w:t xml:space="preserve">After action 9 only: close the ring 4/2/3 to 7/2/3 with a RUCKUS 25G DAC of 3 m or shorter (the stack-port configuration is already in place). The ring tried on 10 October caused packet loss, which matches FI-318592 on cd3. Do it in a change window</w:t>
             </w:r>
           </w:p>
         </w:tc>
@@ -4442,7 +5176,7 @@
                 <w:sz w:val="20"/>
                 <w:szCs w:val="20"/>
               </w:rPr>
-              <w:t xml:space="preserve">Upgrade FastIron if TAC names a release that fixes the fault</w:t>
+              <w:t xml:space="preserve">Upgrade lv6 to FastIron 10.0.10g_cd10 (ICX8200 image RDR10010g_cd10ufi.bin) in a change window; the stack reloads. Check the other 200V stacks' versions and plan the same upgrade before any of them is cabled as a ring</w:t>
             </w:r>
           </w:p>
         </w:tc>
@@ -4476,7 +5210,7 @@
                 <w:sz w:val="20"/>
                 <w:szCs w:val="20"/>
               </w:rPr>
-              <w:t xml:space="preserve">-</w:t>
+              <w:t xml:space="preserve">High</w:t>
             </w:r>
           </w:p>
         </w:tc>
@@ -4532,7 +5266,7 @@
                 <w:sz w:val="20"/>
                 <w:szCs w:val="20"/>
               </w:rPr>
-              <w:t xml:space="preserve">Add an alert for stack member loss (SNMP trap or SmartZone alarm) and raise the 5-of-7 member display with TAC</w:t>
+              <w:t xml:space="preserve">Add an alert for stack member loss (SNMP trap or SmartZone alarm) and raise the 5-of-7 member display with TAC. After the upgrade, check that SmartZone shows the switch's warning events (FI-312861)</w:t>
             </w:r>
           </w:p>
         </w:tc>
@@ -4625,7 +5359,7 @@
         <w:spacing w:after="60"/>
       </w:pPr>
       <w:r>
-        <w:t xml:space="preserve">Before power cycling, connect to unit 3's console and capture skip-page-display, show stack, show logging and show tech-support to a file. This is the evidence the first two failures did not leave.</w:t>
+        <w:t xml:space="preserve">Before power cycling, connect to unit 3's console and capture skip-page-display, show stack, show logging and show tech-support to a file. This is the evidence the first two failures did not leave. (On cd3 and cd10, show tech-support can occasionally cause a reload, FI-311871; on a unit that is already hung this is acceptable.)</w:t>
       </w:r>
     </w:p>
     <w:p>
@@ -4971,6 +5705,19 @@
       </w:pPr>
       <w:r>
         <w:t xml:space="preserve">show stack outputs from 9 and 10 October (in the Trinity 200V VLAN Migration document)</w:t>
+      </w:r>
+    </w:p>
+    <w:p>
+      <w:pPr>
+        <w:pStyle w:val="ListParagraph"/>
+        <w:numPr>
+          <w:ilvl w:val="0"/>
+          <w:numId w:val="1"/>
+        </w:numPr>
+        <w:spacing w:after="60"/>
+      </w:pPr>
+      <w:r>
+        <w:t xml:space="preserve">FastIron 10.0.10g_cd3, cd5, cd8 and cd10 release notes (RUCKUS support portal, login required); held by Dycom, not stored in the repository</w:t>
       </w:r>
     </w:p>
     <w:sectPr>

</xml_diff>

<commit_message>
lv6 RCA: record Ruckus case 02372629
Co-Authored-By: Claude Opus 5.5 <noreply@anthropic.com>
Claude-Session: https://claude.ai/code/session_01BZ7jJsE6GWKm6ehHY39VNr
</commit_message>
<xml_diff>
--- a/Trinity 200V lv6 Stack Unit 3 RCA.docx
+++ b/Trinity 200V lv6 Stack Unit 3 RCA.docx
@@ -313,7 +313,7 @@
                 <w:sz w:val="20"/>
                 <w:szCs w:val="20"/>
               </w:rPr>
-              <w:t xml:space="preserve">Not yet confirmed. Most likely a fault in unit 3 itself (hardware or firmware); waiting on Ruckus TAC</w:t>
+              <w:t xml:space="preserve">Not yet confirmed. Most likely a fault in unit 3 itself (hardware or firmware); waiting on Ruckus TAC (case 02372629)</w:t>
             </w:r>
           </w:p>
         </w:tc>
@@ -4507,7 +4507,7 @@
                 <w:sz w:val="20"/>
                 <w:szCs w:val="20"/>
               </w:rPr>
-              <w:t xml:space="preserve">Open</w:t>
+              <w:t xml:space="preserve">Open: Ruckus case 02372629 raised 16 Oct</w:t>
             </w:r>
           </w:p>
         </w:tc>

</xml_diff>